<commit_message>
vault: job search applications, daily notes, and misc updates
Add Feathr, Freely Payments, Rebuy, and Sell2Rent application materials;
new daily notes and inbox/reading notes; gcal-sidebar plugin and Obsidian
config updates. Gitignore the plugin's data.json (holds live OAuth tokens).

Co-Authored-By: Claude Opus 4.6 <noreply@anthropic.com>
</commit_message>
<xml_diff>
--- a/00 Human/30 Projects/Job Search/Applications/Seeq/chris-monnat-cover-letter(seeq).docx
+++ b/00 Human/30 Projects/Job Search/Applications/Seeq/chris-monnat-cover-letter(seeq).docx
@@ -326,116 +326,118 @@
     </w:p>
     <w:p>
       <w:pPr>
-        <w:spacing w:after="120" w:before="0"/>
-        <w:jc w:val="left"/>
+        <w:spacing w:after="120"/>
       </w:pPr>
     </w:p>
     <w:p>
       <w:pPr>
-        <w:spacing w:after="280" w:before="0"/>
-        <w:jc w:val="left"/>
+        <w:spacing w:after="280"/>
       </w:pPr>
       <w:r>
         <w:rPr>
           <w:sz w:val="22"/>
         </w:rPr>
-        <w:t xml:space="preserve">August 8, 2026</w:t>
+        <w:t>August 8, 2026</w:t>
       </w:r>
     </w:p>
     <w:p>
       <w:pPr>
-        <w:spacing w:after="200" w:before="0"/>
-        <w:jc w:val="left"/>
+        <w:spacing w:after="200"/>
       </w:pPr>
       <w:r>
         <w:rPr>
           <w:sz w:val="22"/>
         </w:rPr>
-        <w:t xml:space="preserve">Dear Hiring Team,</w:t>
+        <w:t>Dear Hiring Team,</w:t>
       </w:r>
     </w:p>
     <w:p>
       <w:pPr>
-        <w:spacing w:after="240" w:before="0"/>
-        <w:jc w:val="left"/>
+        <w:spacing w:after="240"/>
       </w:pPr>
       <w:r>
         <w:rPr>
           <w:sz w:val="22"/>
         </w:rPr>
-        <w:t xml:space="preserve">I am an engineering leader who came up through architecture and still ships code. Your posting asks for a hands-on leader to take an already-solid set of squads to the next level and expand capacity as Seeq grows. That is the work I do best, and it is the work I want to keep doing.</w:t>
+        <w:t>I am an engineering leader who came up through architecture and still ships code. Your posting asks for a hands-on leader to take an already-solid set of squads to the next level and expand capacity as Seeq grows. That is the work I do best, and it is the work I want to keep doing.</w:t>
       </w:r>
     </w:p>
     <w:p>
       <w:pPr>
-        <w:spacing w:after="240" w:before="0"/>
-        <w:jc w:val="left"/>
+        <w:spacing w:after="240"/>
       </w:pPr>
       <w:r>
         <w:rPr>
           <w:sz w:val="22"/>
         </w:rPr>
-        <w:t xml:space="preserve">Seeq is the part that pulls me in. You have been remote-first for 13 years and built a global team that trusts each other, which is exactly how I want to work and how I lead. The problems are real too: streaming calculation, storage, and distributed computing on industrial process data, with AI showing up in both the tooling and the product. I have strong opinions about AI in engineering, and they line up with yours. Used well, it makes good engineers stronger. Used carelessly, it ships slop.</w:t>
+        <w:t>Seeq is the part that pulls me in. You have been remote-first for 13 years and built a global team that trusts each other, which is exactly how I want to work and how I lead. The problems are real too: streaming calculation, storage, and distributed computing on industrial process data, with AI showing up in both the tooling and the product. I have strong opinions about AI in engineering, and they line up with yours. Used well, it makes good engineers stronger. Used carelessly, it ships slop.</w:t>
       </w:r>
     </w:p>
     <w:p>
       <w:pPr>
-        <w:spacing w:after="240" w:before="0"/>
-        <w:jc w:val="left"/>
+        <w:spacing w:after="240"/>
       </w:pPr>
       <w:r>
         <w:rPr>
           <w:sz w:val="22"/>
         </w:rPr>
-        <w:t xml:space="preserve">At Industry Dive I founded and scaled the engineering organization behind more than 100 high-traffic properties used by millions, grew one team of 8 into five cross-functional squads of 40-plus across time zones, and built the paved-road platform that cut time-to-ship 35 percent so teams shipped features instead of fighting infrastructure. At Pipeline 360, a PE-backed SaaS company, I took a revenue-critical, multi-tenant platform on AWS and Kubernetes from zero to production in under 90 days, protecting an 8-figure line. Today at Dual Logic I move agentic and LLM-backed systems from early pilots to governed production, with real evaluation and guardrails.</w:t>
+        <w:t xml:space="preserve">At Industry Dive I founded and scaled the engineering organization behind more than 100 high-traffic properties used by millions, grew one team of 8 into five cross-functional squads of 40-plus across time zones, and built the paved-road platform that cut time-to-ship 35 percent so teams shipped features instead of fighting infrastructure. At Pipeline 360, a PE-backed SaaS company, I took a revenue-critical, multi-tenant platform on AWS and Kubernetes from zero to production in under 90 days, protecting an </w:t>
       </w:r>
-    </w:p>
-    <w:p>
-      <w:pPr>
-        <w:spacing w:after="240" w:before="0"/>
-        <w:jc w:val="left"/>
-      </w:pPr>
       <w:r>
         <w:rPr>
           <w:sz w:val="22"/>
         </w:rPr>
-        <w:t xml:space="preserve">I have not worked in industrial process data before, so I will not pretend that domain is second nature yet. What I have done is lead through influence rather than authority, coach engineers and managers into stronger versions of themselves, and get productive in a new domain fast and in the open. Distributed systems, cloud, and delivery discipline travel with me. The rest I will learn from your team, which sounds like a group worth learning from.</w:t>
+        <w:t xml:space="preserve">8-figure </w:t>
       </w:r>
-    </w:p>
-    <w:p>
-      <w:pPr>
-        <w:spacing w:after="240" w:before="0"/>
-        <w:jc w:val="left"/>
-      </w:pPr>
       <w:r>
         <w:rPr>
           <w:sz w:val="22"/>
         </w:rPr>
-        <w:t xml:space="preserve">I would welcome a conversation about your end-user squads, where you want them to go, and how I would help get them there.</w:t>
+        <w:t xml:space="preserve">revenue </w:t>
       </w:r>
-    </w:p>
-    <w:p>
-      <w:pPr>
-        <w:spacing w:after="0" w:before="0"/>
-        <w:jc w:val="left"/>
-      </w:pPr>
       <w:r>
         <w:rPr>
           <w:sz w:val="22"/>
         </w:rPr>
-        <w:t xml:space="preserve">Sincerely,</w:t>
+        <w:t>line. Today at Dual Logic I move agentic and LLM-backed systems from early pilots to governed production, with real evaluation and guardrails.</w:t>
       </w:r>
     </w:p>
     <w:p>
       <w:pPr>
-        <w:spacing w:after="0" w:before="0"/>
-        <w:jc w:val="left"/>
+        <w:spacing w:after="240"/>
       </w:pPr>
       <w:r>
         <w:rPr>
           <w:sz w:val="22"/>
         </w:rPr>
-        <w:t xml:space="preserve">Chris Monnat</w:t>
+        <w:t>I have not worked in industrial process data before, so I will not pretend that domain is second nature yet. What I have done is lead through influence rather than authority, coach engineers and managers into stronger versions of themselves, and get productive in a new domain fast and in the open. Distributed systems, cloud, and delivery discipline travel with me. The rest I will learn from your team, which sounds like a group worth learning from.</w:t>
+      </w:r>
+    </w:p>
+    <w:p>
+      <w:pPr>
+        <w:spacing w:after="240"/>
+      </w:pPr>
+      <w:r>
+        <w:rPr>
+          <w:sz w:val="22"/>
+        </w:rPr>
+        <w:t>I would welcome a conversation about your end-user squads, where you want them to go, and how I would help get them there.</w:t>
+      </w:r>
+    </w:p>
+    <w:p>
+      <w:r>
+        <w:rPr>
+          <w:sz w:val="22"/>
+        </w:rPr>
+        <w:t>Sincerely,</w:t>
+      </w:r>
+    </w:p>
+    <w:p>
+      <w:r>
+        <w:rPr>
+          <w:sz w:val="22"/>
+        </w:rPr>
+        <w:t>Chris Monnat</w:t>
       </w:r>
     </w:p>
     <w:sectPr>
@@ -483,6 +485,11 @@
         <w:docPartUnique/>
       </w:docPartObj>
     </w:sdtPr>
+    <w:sdtEndPr>
+      <w:rPr>
+        <w:rStyle w:val="PageNumber"/>
+      </w:rPr>
+    </w:sdtEndPr>
     <w:sdtContent>
       <w:p>
         <w:pPr>
@@ -541,6 +548,11 @@
         <w:docPartUnique/>
       </w:docPartObj>
     </w:sdtPr>
+    <w:sdtEndPr>
+      <w:rPr>
+        <w:rStyle w:val="PageNumber"/>
+      </w:rPr>
+    </w:sdtEndPr>
     <w:sdtContent>
       <w:p>
         <w:pPr>

</xml_diff>